<commit_message>
Home page done (for now)
</commit_message>
<xml_diff>
--- a/docs/Rules To Follow/Icon Size and Format.docx
+++ b/docs/Rules To Follow/Icon Size and Format.docx
@@ -19,363 +19,10 @@
         <w:pStyle w:val="NormalWeb"/>
       </w:pPr>
       <w:r>
-        <w:t xml:space="preserve">All sidebar navigation icons must be </w:t>
-      </w:r>
-      <w:r>
-        <w:rPr>
-          <w:b/>
-          <w:bCs/>
-        </w:rPr>
-        <w:t>32x32</w:t>
-      </w:r>
-      <w:r>
-        <w:t xml:space="preserve"> pixels and saved as PNG files with a transparent background. Source icons should be exported or downloaded at a higher resolution (e.g. 64x64) and scaled down to </w:t>
-      </w:r>
-      <w:r>
-        <w:rPr>
-          <w:b/>
-          <w:bCs/>
-        </w:rPr>
-        <w:t>32x32</w:t>
-      </w:r>
-      <w:r>
-        <w:t>, rather than upscaling a smaller image, as this preserves visual sharpness and avoids pixelation. Using PNG with transparency ensures icons display correctly against the sidebar's background regardless of button colour or hover state.</w:t>
+        <w:t>All sidebar navigation icons must be 32x32 pixels and saved as PNG files with a transparent background. Source icons should be exported or downloaded at a higher resolution (e.g. 64x64) and scaled down to 32x32, rather than upscaling a smaller image, as this preserves visual sharpness and avoids pixelation. Using PNG with transparency ensures icons display correctly against the sidebar's background regardless of button colour or hover state.</w:t>
       </w:r>
     </w:p>
     <w:p/>
-    <w:p/>
-    <w:p>
-      <w:pPr>
-        <w:spacing w:before="100" w:beforeAutospacing="1" w:after="100" w:afterAutospacing="1" w:line="240" w:lineRule="auto"/>
-        <w:rPr>
-          <w:rFonts w:ascii="Times New Roman" w:eastAsia="Times New Roman" w:hAnsi="Times New Roman" w:cs="Times New Roman"/>
-          <w:kern w:val="0"/>
-          <w:sz w:val="24"/>
-          <w:szCs w:val="24"/>
-          <w:lang w:eastAsia="en-ZA"/>
-          <w14:ligatures w14:val="none"/>
-        </w:rPr>
-      </w:pPr>
-      <w:r>
-        <w:rPr>
-          <w:rFonts w:ascii="Times New Roman" w:eastAsia="Times New Roman" w:hAnsi="Times New Roman" w:cs="Times New Roman"/>
-          <w:b/>
-          <w:bCs/>
-          <w:kern w:val="0"/>
-          <w:sz w:val="24"/>
-          <w:szCs w:val="24"/>
-          <w:lang w:eastAsia="en-ZA"/>
-          <w14:ligatures w14:val="none"/>
-        </w:rPr>
-        <w:t>Colour Scheme</w:t>
-      </w:r>
-    </w:p>
-    <w:p>
-      <w:pPr>
-        <w:spacing w:before="100" w:beforeAutospacing="1" w:after="100" w:afterAutospacing="1" w:line="240" w:lineRule="auto"/>
-        <w:rPr>
-          <w:rFonts w:ascii="Times New Roman" w:eastAsia="Times New Roman" w:hAnsi="Times New Roman" w:cs="Times New Roman"/>
-          <w:kern w:val="0"/>
-          <w:sz w:val="24"/>
-          <w:szCs w:val="24"/>
-          <w:lang w:eastAsia="en-ZA"/>
-          <w14:ligatures w14:val="none"/>
-        </w:rPr>
-      </w:pPr>
-      <w:r>
-        <w:rPr>
-          <w:rFonts w:ascii="Times New Roman" w:eastAsia="Times New Roman" w:hAnsi="Times New Roman" w:cs="Times New Roman"/>
-          <w:kern w:val="0"/>
-          <w:sz w:val="24"/>
-          <w:szCs w:val="24"/>
-          <w:lang w:eastAsia="en-ZA"/>
-          <w14:ligatures w14:val="none"/>
-        </w:rPr>
-        <w:t>Primary background (main content): RGB (</w:t>
-      </w:r>
-      <w:r>
-        <w:t>236, 240, 245</w:t>
-      </w:r>
-      <w:r>
-        <w:rPr>
-          <w:rFonts w:ascii="Times New Roman" w:eastAsia="Times New Roman" w:hAnsi="Times New Roman" w:cs="Times New Roman"/>
-          <w:kern w:val="0"/>
-          <w:sz w:val="24"/>
-          <w:szCs w:val="24"/>
-          <w:lang w:eastAsia="en-ZA"/>
-          <w14:ligatures w14:val="none"/>
-        </w:rPr>
-        <w:t>)</w:t>
-      </w:r>
-    </w:p>
-    <w:p>
-      <w:pPr>
-        <w:spacing w:before="100" w:beforeAutospacing="1" w:after="100" w:afterAutospacing="1" w:line="240" w:lineRule="auto"/>
-        <w:rPr>
-          <w:rFonts w:ascii="Times New Roman" w:eastAsia="Times New Roman" w:hAnsi="Times New Roman" w:cs="Times New Roman"/>
-          <w:kern w:val="0"/>
-          <w:sz w:val="24"/>
-          <w:szCs w:val="24"/>
-          <w:lang w:eastAsia="en-ZA"/>
-          <w14:ligatures w14:val="none"/>
-        </w:rPr>
-      </w:pPr>
-      <w:r>
-        <w:rPr>
-          <w:rFonts w:ascii="Times New Roman" w:eastAsia="Times New Roman" w:hAnsi="Times New Roman" w:cs="Times New Roman"/>
-          <w:kern w:val="0"/>
-          <w:sz w:val="24"/>
-          <w:szCs w:val="24"/>
-          <w:lang w:eastAsia="en-ZA"/>
-          <w14:ligatures w14:val="none"/>
-        </w:rPr>
-        <w:t>Sidebar background: RGB (</w:t>
-      </w:r>
-      <w:r>
-        <w:rPr>
-          <w:rFonts w:ascii="Times New Roman" w:eastAsia="Times New Roman" w:hAnsi="Times New Roman" w:cs="Times New Roman"/>
-          <w:kern w:val="0"/>
-          <w:sz w:val="24"/>
-          <w:szCs w:val="24"/>
-          <w:lang w:eastAsia="en-ZA"/>
-          <w14:ligatures w14:val="none"/>
-        </w:rPr>
-        <w:t>222, 235, 245</w:t>
-      </w:r>
-      <w:r>
-        <w:rPr>
-          <w:rFonts w:ascii="Times New Roman" w:eastAsia="Times New Roman" w:hAnsi="Times New Roman" w:cs="Times New Roman"/>
-          <w:kern w:val="0"/>
-          <w:sz w:val="24"/>
-          <w:szCs w:val="24"/>
-          <w:lang w:eastAsia="en-ZA"/>
-          <w14:ligatures w14:val="none"/>
-        </w:rPr>
-        <w:t>)</w:t>
-      </w:r>
-    </w:p>
-    <w:p>
-      <w:pPr>
-        <w:spacing w:before="100" w:beforeAutospacing="1" w:after="100" w:afterAutospacing="1" w:line="240" w:lineRule="auto"/>
-        <w:rPr>
-          <w:rFonts w:ascii="Times New Roman" w:eastAsia="Times New Roman" w:hAnsi="Times New Roman" w:cs="Times New Roman"/>
-          <w:kern w:val="0"/>
-          <w:sz w:val="24"/>
-          <w:szCs w:val="24"/>
-          <w:lang w:eastAsia="en-ZA"/>
-          <w14:ligatures w14:val="none"/>
-        </w:rPr>
-      </w:pPr>
-      <w:r>
-        <w:rPr>
-          <w:rFonts w:ascii="Times New Roman" w:eastAsia="Times New Roman" w:hAnsi="Times New Roman" w:cs="Times New Roman"/>
-          <w:kern w:val="0"/>
-          <w:sz w:val="24"/>
-          <w:szCs w:val="24"/>
-          <w:lang w:eastAsia="en-ZA"/>
-          <w14:ligatures w14:val="none"/>
-        </w:rPr>
-        <w:t>Border for the bars: RGB (</w:t>
-      </w:r>
-      <w:r>
-        <w:t>180, 200, 215</w:t>
-      </w:r>
-      <w:r>
-        <w:t>)</w:t>
-      </w:r>
-    </w:p>
-    <w:p>
-      <w:pPr>
-        <w:spacing w:before="100" w:beforeAutospacing="1" w:after="100" w:afterAutospacing="1" w:line="240" w:lineRule="auto"/>
-        <w:rPr>
-          <w:rFonts w:ascii="Times New Roman" w:eastAsia="Times New Roman" w:hAnsi="Times New Roman" w:cs="Times New Roman"/>
-          <w:kern w:val="0"/>
-          <w:sz w:val="24"/>
-          <w:szCs w:val="24"/>
-          <w:lang w:eastAsia="en-ZA"/>
-          <w14:ligatures w14:val="none"/>
-        </w:rPr>
-      </w:pPr>
-      <w:r>
-        <w:rPr>
-          <w:rFonts w:ascii="Times New Roman" w:eastAsia="Times New Roman" w:hAnsi="Times New Roman" w:cs="Times New Roman"/>
-          <w:kern w:val="0"/>
-          <w:sz w:val="24"/>
-          <w:szCs w:val="24"/>
-          <w:lang w:eastAsia="en-ZA"/>
-          <w14:ligatures w14:val="none"/>
-        </w:rPr>
-        <w:t>Primary accent (buttons, active states, headers): RGB (58, 124, 165)</w:t>
-      </w:r>
-    </w:p>
-    <w:p>
-      <w:pPr>
-        <w:spacing w:before="100" w:beforeAutospacing="1" w:after="100" w:afterAutospacing="1" w:line="240" w:lineRule="auto"/>
-        <w:rPr>
-          <w:rFonts w:ascii="Times New Roman" w:eastAsia="Times New Roman" w:hAnsi="Times New Roman" w:cs="Times New Roman"/>
-          <w:kern w:val="0"/>
-          <w:sz w:val="24"/>
-          <w:szCs w:val="24"/>
-          <w:lang w:eastAsia="en-ZA"/>
-          <w14:ligatures w14:val="none"/>
-        </w:rPr>
-      </w:pPr>
-      <w:r>
-        <w:rPr>
-          <w:rFonts w:ascii="Times New Roman" w:eastAsia="Times New Roman" w:hAnsi="Times New Roman" w:cs="Times New Roman"/>
-          <w:kern w:val="0"/>
-          <w:sz w:val="24"/>
-          <w:szCs w:val="24"/>
-          <w:lang w:eastAsia="en-ZA"/>
-          <w14:ligatures w14:val="none"/>
-        </w:rPr>
-        <w:t>Active/selected navigation item: RGB (58, 124, 165) background with white RGB (255, 255, 255) icon/text</w:t>
-      </w:r>
-    </w:p>
-    <w:p>
-      <w:pPr>
-        <w:spacing w:before="100" w:beforeAutospacing="1" w:after="100" w:afterAutospacing="1" w:line="240" w:lineRule="auto"/>
-        <w:rPr>
-          <w:rFonts w:ascii="Times New Roman" w:eastAsia="Times New Roman" w:hAnsi="Times New Roman" w:cs="Times New Roman"/>
-          <w:kern w:val="0"/>
-          <w:sz w:val="24"/>
-          <w:szCs w:val="24"/>
-          <w:lang w:eastAsia="en-ZA"/>
-          <w14:ligatures w14:val="none"/>
-        </w:rPr>
-      </w:pPr>
-      <w:r>
-        <w:rPr>
-          <w:rFonts w:ascii="Times New Roman" w:eastAsia="Times New Roman" w:hAnsi="Times New Roman" w:cs="Times New Roman"/>
-          <w:kern w:val="0"/>
-          <w:sz w:val="24"/>
-          <w:szCs w:val="24"/>
-          <w:lang w:eastAsia="en-ZA"/>
-          <w14:ligatures w14:val="none"/>
-        </w:rPr>
-        <w:t>Status indicators:</w:t>
-      </w:r>
-    </w:p>
-    <w:p>
-      <w:pPr>
-        <w:numPr>
-          <w:ilvl w:val="0"/>
-          <w:numId w:val="1"/>
-        </w:numPr>
-        <w:spacing w:before="100" w:beforeAutospacing="1" w:after="100" w:afterAutospacing="1" w:line="240" w:lineRule="auto"/>
-        <w:rPr>
-          <w:rFonts w:ascii="Times New Roman" w:eastAsia="Times New Roman" w:hAnsi="Times New Roman" w:cs="Times New Roman"/>
-          <w:kern w:val="0"/>
-          <w:sz w:val="24"/>
-          <w:szCs w:val="24"/>
-          <w:lang w:eastAsia="en-ZA"/>
-          <w14:ligatures w14:val="none"/>
-        </w:rPr>
-      </w:pPr>
-      <w:r>
-        <w:rPr>
-          <w:rFonts w:ascii="Times New Roman" w:eastAsia="Times New Roman" w:hAnsi="Times New Roman" w:cs="Times New Roman"/>
-          <w:kern w:val="0"/>
-          <w:sz w:val="24"/>
-          <w:szCs w:val="24"/>
-          <w:lang w:eastAsia="en-ZA"/>
-          <w14:ligatures w14:val="none"/>
-        </w:rPr>
-        <w:t>Success / Available: RGB (76, 175, 125)</w:t>
-      </w:r>
-    </w:p>
-    <w:p>
-      <w:pPr>
-        <w:numPr>
-          <w:ilvl w:val="0"/>
-          <w:numId w:val="1"/>
-        </w:numPr>
-        <w:spacing w:before="100" w:beforeAutospacing="1" w:after="100" w:afterAutospacing="1" w:line="240" w:lineRule="auto"/>
-        <w:rPr>
-          <w:rFonts w:ascii="Times New Roman" w:eastAsia="Times New Roman" w:hAnsi="Times New Roman" w:cs="Times New Roman"/>
-          <w:kern w:val="0"/>
-          <w:sz w:val="24"/>
-          <w:szCs w:val="24"/>
-          <w:lang w:eastAsia="en-ZA"/>
-          <w14:ligatures w14:val="none"/>
-        </w:rPr>
-      </w:pPr>
-      <w:r>
-        <w:rPr>
-          <w:rFonts w:ascii="Times New Roman" w:eastAsia="Times New Roman" w:hAnsi="Times New Roman" w:cs="Times New Roman"/>
-          <w:kern w:val="0"/>
-          <w:sz w:val="24"/>
-          <w:szCs w:val="24"/>
-          <w:lang w:eastAsia="en-ZA"/>
-          <w14:ligatures w14:val="none"/>
-        </w:rPr>
-        <w:t>Warning / Waiting: RGB (232, 165, 72)</w:t>
-      </w:r>
-    </w:p>
-    <w:p>
-      <w:pPr>
-        <w:numPr>
-          <w:ilvl w:val="0"/>
-          <w:numId w:val="1"/>
-        </w:numPr>
-        <w:spacing w:before="100" w:beforeAutospacing="1" w:after="100" w:afterAutospacing="1" w:line="240" w:lineRule="auto"/>
-        <w:rPr>
-          <w:rFonts w:ascii="Times New Roman" w:eastAsia="Times New Roman" w:hAnsi="Times New Roman" w:cs="Times New Roman"/>
-          <w:kern w:val="0"/>
-          <w:sz w:val="24"/>
-          <w:szCs w:val="24"/>
-          <w:lang w:eastAsia="en-ZA"/>
-          <w14:ligatures w14:val="none"/>
-        </w:rPr>
-      </w:pPr>
-      <w:r>
-        <w:rPr>
-          <w:rFonts w:ascii="Times New Roman" w:eastAsia="Times New Roman" w:hAnsi="Times New Roman" w:cs="Times New Roman"/>
-          <w:kern w:val="0"/>
-          <w:sz w:val="24"/>
-          <w:szCs w:val="24"/>
-          <w:lang w:eastAsia="en-ZA"/>
-          <w14:ligatures w14:val="none"/>
-        </w:rPr>
-        <w:t>Alert / Urgent: RGB (217, 83, 79)</w:t>
-      </w:r>
-    </w:p>
-    <w:p>
-      <w:pPr>
-        <w:numPr>
-          <w:ilvl w:val="0"/>
-          <w:numId w:val="1"/>
-        </w:numPr>
-        <w:spacing w:before="100" w:beforeAutospacing="1" w:after="100" w:afterAutospacing="1" w:line="240" w:lineRule="auto"/>
-        <w:rPr>
-          <w:rFonts w:ascii="Times New Roman" w:eastAsia="Times New Roman" w:hAnsi="Times New Roman" w:cs="Times New Roman"/>
-          <w:kern w:val="0"/>
-          <w:sz w:val="24"/>
-          <w:szCs w:val="24"/>
-          <w:lang w:eastAsia="en-ZA"/>
-          <w14:ligatures w14:val="none"/>
-        </w:rPr>
-      </w:pPr>
-      <w:r>
-        <w:rPr>
-          <w:rFonts w:ascii="Times New Roman" w:eastAsia="Times New Roman" w:hAnsi="Times New Roman" w:cs="Times New Roman"/>
-          <w:kern w:val="0"/>
-          <w:sz w:val="24"/>
-          <w:szCs w:val="24"/>
-          <w:lang w:eastAsia="en-ZA"/>
-          <w14:ligatures w14:val="none"/>
-        </w:rPr>
-        <w:t>Neutral / Info: RGB (123, 143, 161)</w:t>
-      </w:r>
-    </w:p>
-    <w:p>
-      <w:pPr>
-        <w:rPr>
-          <w:b/>
-          <w:bCs/>
-        </w:rPr>
-      </w:pPr>
-    </w:p>
     <w:sectPr>
       <w:pgSz w:w="11906" w:h="16838"/>
       <w:pgMar w:top="1440" w:right="1440" w:bottom="1440" w:left="1440" w:header="708" w:footer="708" w:gutter="0"/>
@@ -384,163 +31,6 @@
     </w:sectPr>
   </w:body>
 </w:document>
-</file>
-
-<file path=word/numbering.xml><?xml version="1.0" encoding="utf-8"?>
-<w:numbering xmlns:wpc="http://schemas.microsoft.com/office/word/2010/wordprocessingCanvas" xmlns:cx="http://schemas.microsoft.com/office/drawing/2014/chartex" xmlns:cx1="http://schemas.microsoft.com/office/drawing/2015/9/8/chartex" xmlns:cx2="http://schemas.microsoft.com/office/drawing/2015/10/21/chartex" xmlns:cx3="http://schemas.microsoft.com/office/drawing/2016/5/9/chartex" xmlns:cx4="http://schemas.microsoft.com/office/drawing/2016/5/10/chartex" xmlns:cx5="http://schemas.microsoft.com/office/drawing/2016/5/11/chartex" xmlns:cx6="http://schemas.microsoft.com/office/drawing/2016/5/12/chartex" xmlns:cx7="http://schemas.microsoft.com/office/drawing/2016/5/13/chartex" xmlns:cx8="http://schemas.microsoft.com/office/drawing/2016/5/14/chartex" xmlns:mc="http://schemas.openxmlformats.org/markup-compatibility/2006" xmlns:aink="http://schemas.microsoft.com/office/drawing/2016/ink" xmlns:am3d="http://schemas.microsoft.com/office/drawing/2017/model3d" xmlns:o="urn:schemas-microsoft-com:office:office" xmlns:oel="http://schemas.microsoft.com/office/2019/extlst" xmlns:r="http://schemas.openxmlformats.org/officeDocument/2006/relationships" xmlns:m="http://schemas.openxmlformats.org/officeDocument/2006/math" xmlns:v="urn:schemas-microsoft-com:vml" xmlns:wp14="http://schemas.microsoft.com/office/word/2010/wordprocessingDrawing" xmlns:wp="http://schemas.openxmlformats.org/drawingml/2006/wordprocessingDrawing" xmlns:w10="urn:schemas-microsoft-com:office:word" xmlns:w="http://schemas.openxmlformats.org/wordprocessingml/2006/main" xmlns:w14="http://schemas.microsoft.com/office/word/2010/wordml" xmlns:w15="http://schemas.microsoft.com/office/word/2012/wordml" xmlns:w16cex="http://schemas.microsoft.com/office/word/2018/wordml/cex" xmlns:w16cid="http://schemas.microsoft.com/office/word/2016/wordml/cid" xmlns:w16="http://schemas.microsoft.com/office/word/2018/wordml" xmlns:w16du="http://schemas.microsoft.com/office/word/2023/wordml/word16du" xmlns:w16sdtdh="http://schemas.microsoft.com/office/word/2020/wordml/sdtdatahash" xmlns:w16se="http://schemas.microsoft.com/office/word/2015/wordml/symex" xmlns:wpg="http://schemas.microsoft.com/office/word/2010/wordprocessingGroup" xmlns:wpi="http://schemas.microsoft.com/office/word/2010/wordprocessingInk" xmlns:wne="http://schemas.microsoft.com/office/word/2006/wordml" xmlns:wps="http://schemas.microsoft.com/office/word/2010/wordprocessingShape" mc:Ignorable="w14 w15 w16se w16cid w16 w16cex w16sdtdh w16du wp14">
-  <w:abstractNum w:abstractNumId="0" w15:restartNumberingAfterBreak="0">
-    <w:nsid w:val="1A950B15"/>
-    <w:multiLevelType w:val="multilevel"/>
-    <w:tmpl w:val="B942C6A4"/>
-    <w:lvl w:ilvl="0">
-      <w:start w:val="1"/>
-      <w:numFmt w:val="bullet"/>
-      <w:lvlText w:val=""/>
-      <w:lvlJc w:val="left"/>
-      <w:pPr>
-        <w:tabs>
-          <w:tab w:val="num" w:pos="720"/>
-        </w:tabs>
-        <w:ind w:left="720" w:hanging="360"/>
-      </w:pPr>
-      <w:rPr>
-        <w:rFonts w:ascii="Symbol" w:hAnsi="Symbol" w:hint="default"/>
-        <w:sz w:val="20"/>
-      </w:rPr>
-    </w:lvl>
-    <w:lvl w:ilvl="1" w:tentative="1">
-      <w:start w:val="1"/>
-      <w:numFmt w:val="bullet"/>
-      <w:lvlText w:val="o"/>
-      <w:lvlJc w:val="left"/>
-      <w:pPr>
-        <w:tabs>
-          <w:tab w:val="num" w:pos="1440"/>
-        </w:tabs>
-        <w:ind w:left="1440" w:hanging="360"/>
-      </w:pPr>
-      <w:rPr>
-        <w:rFonts w:ascii="Courier New" w:hAnsi="Courier New" w:hint="default"/>
-        <w:sz w:val="20"/>
-      </w:rPr>
-    </w:lvl>
-    <w:lvl w:ilvl="2" w:tentative="1">
-      <w:start w:val="1"/>
-      <w:numFmt w:val="bullet"/>
-      <w:lvlText w:val=""/>
-      <w:lvlJc w:val="left"/>
-      <w:pPr>
-        <w:tabs>
-          <w:tab w:val="num" w:pos="2160"/>
-        </w:tabs>
-        <w:ind w:left="2160" w:hanging="360"/>
-      </w:pPr>
-      <w:rPr>
-        <w:rFonts w:ascii="Wingdings" w:hAnsi="Wingdings" w:hint="default"/>
-        <w:sz w:val="20"/>
-      </w:rPr>
-    </w:lvl>
-    <w:lvl w:ilvl="3" w:tentative="1">
-      <w:start w:val="1"/>
-      <w:numFmt w:val="bullet"/>
-      <w:lvlText w:val=""/>
-      <w:lvlJc w:val="left"/>
-      <w:pPr>
-        <w:tabs>
-          <w:tab w:val="num" w:pos="2880"/>
-        </w:tabs>
-        <w:ind w:left="2880" w:hanging="360"/>
-      </w:pPr>
-      <w:rPr>
-        <w:rFonts w:ascii="Wingdings" w:hAnsi="Wingdings" w:hint="default"/>
-        <w:sz w:val="20"/>
-      </w:rPr>
-    </w:lvl>
-    <w:lvl w:ilvl="4" w:tentative="1">
-      <w:start w:val="1"/>
-      <w:numFmt w:val="bullet"/>
-      <w:lvlText w:val=""/>
-      <w:lvlJc w:val="left"/>
-      <w:pPr>
-        <w:tabs>
-          <w:tab w:val="num" w:pos="3600"/>
-        </w:tabs>
-        <w:ind w:left="3600" w:hanging="360"/>
-      </w:pPr>
-      <w:rPr>
-        <w:rFonts w:ascii="Wingdings" w:hAnsi="Wingdings" w:hint="default"/>
-        <w:sz w:val="20"/>
-      </w:rPr>
-    </w:lvl>
-    <w:lvl w:ilvl="5" w:tentative="1">
-      <w:start w:val="1"/>
-      <w:numFmt w:val="bullet"/>
-      <w:lvlText w:val=""/>
-      <w:lvlJc w:val="left"/>
-      <w:pPr>
-        <w:tabs>
-          <w:tab w:val="num" w:pos="4320"/>
-        </w:tabs>
-        <w:ind w:left="4320" w:hanging="360"/>
-      </w:pPr>
-      <w:rPr>
-        <w:rFonts w:ascii="Wingdings" w:hAnsi="Wingdings" w:hint="default"/>
-        <w:sz w:val="20"/>
-      </w:rPr>
-    </w:lvl>
-    <w:lvl w:ilvl="6" w:tentative="1">
-      <w:start w:val="1"/>
-      <w:numFmt w:val="bullet"/>
-      <w:lvlText w:val=""/>
-      <w:lvlJc w:val="left"/>
-      <w:pPr>
-        <w:tabs>
-          <w:tab w:val="num" w:pos="5040"/>
-        </w:tabs>
-        <w:ind w:left="5040" w:hanging="360"/>
-      </w:pPr>
-      <w:rPr>
-        <w:rFonts w:ascii="Wingdings" w:hAnsi="Wingdings" w:hint="default"/>
-        <w:sz w:val="20"/>
-      </w:rPr>
-    </w:lvl>
-    <w:lvl w:ilvl="7" w:tentative="1">
-      <w:start w:val="1"/>
-      <w:numFmt w:val="bullet"/>
-      <w:lvlText w:val=""/>
-      <w:lvlJc w:val="left"/>
-      <w:pPr>
-        <w:tabs>
-          <w:tab w:val="num" w:pos="5760"/>
-        </w:tabs>
-        <w:ind w:left="5760" w:hanging="360"/>
-      </w:pPr>
-      <w:rPr>
-        <w:rFonts w:ascii="Wingdings" w:hAnsi="Wingdings" w:hint="default"/>
-        <w:sz w:val="20"/>
-      </w:rPr>
-    </w:lvl>
-    <w:lvl w:ilvl="8" w:tentative="1">
-      <w:start w:val="1"/>
-      <w:numFmt w:val="bullet"/>
-      <w:lvlText w:val=""/>
-      <w:lvlJc w:val="left"/>
-      <w:pPr>
-        <w:tabs>
-          <w:tab w:val="num" w:pos="6480"/>
-        </w:tabs>
-        <w:ind w:left="6480" w:hanging="360"/>
-      </w:pPr>
-      <w:rPr>
-        <w:rFonts w:ascii="Wingdings" w:hAnsi="Wingdings" w:hint="default"/>
-        <w:sz w:val="20"/>
-      </w:rPr>
-    </w:lvl>
-  </w:abstractNum>
-  <w:num w:numId="1" w16cid:durableId="163594062">
-    <w:abstractNumId w:val="0"/>
-  </w:num>
-</w:numbering>
 </file>
 
 <file path=word/styles.xml><?xml version="1.0" encoding="utf-8"?>

</xml_diff>